<commit_message>
updated ERD and added a query to get avg length of stay for each species per shelter
</commit_message>
<xml_diff>
--- a/additional documents/Animal Shelter Analysis ERD.docx
+++ b/additional documents/Animal Shelter Analysis ERD.docx
@@ -28,7 +28,7 @@
         <w:fldChar w:fldCharType="begin"/>
       </w:r>
       <w:r>
-        <w:instrText xml:space="preserve"> INCLUDEPICTURE "https://documents.lucid.app/documents/3aed4ac4-07c4-4ee9-b34a-53fff77ece57/pages/0_0?a=720&amp;x=985&amp;y=464&amp;w=1630&amp;h=1001&amp;store=1&amp;accept=image%2F*&amp;auth=LCA%204e9cb56a16f8ac1be2ff212b4509c6b59b724c3cfe6f0e5587e9373af750d389-ts%3D1765040721" \* MERGEFORMATINET </w:instrText>
+        <w:instrText xml:space="preserve"> INCLUDEPICTURE "https://documents.lucid.app/documents/3aed4ac4-07c4-4ee9-b34a-53fff77ece57/pages/0_0?a=749&amp;x=985&amp;y=463&amp;w=1630&amp;h=1036&amp;store=1&amp;accept=image%2F*&amp;auth=LCA%2082f541d4a973178dc9258438684bb6e85644082788cc850d09a25be25c4b4f38-ts%3D1765048870" \* MERGEFORMATINET </w:instrText>
       </w:r>
       <w:r>
         <w:fldChar w:fldCharType="separate"/>
@@ -38,10 +38,10 @@
           <w:noProof/>
         </w:rPr>
         <w:drawing>
-          <wp:inline distT="0" distB="0" distL="0" distR="0" wp14:anchorId="7159BE27" wp14:editId="61823469">
-            <wp:extent cx="5943600" cy="3649345"/>
+          <wp:inline distT="0" distB="0" distL="0" distR="0" wp14:anchorId="3913A906" wp14:editId="74194B04">
+            <wp:extent cx="5943600" cy="3776980"/>
             <wp:effectExtent l="0" t="0" r="0" b="0"/>
-            <wp:docPr id="1468507677" name="Picture 2" descr="A diagram of a computer&#10;&#10;AI-generated content may be incorrect."/>
+            <wp:docPr id="1277692173" name="Picture 1" descr="A diagram of a computer&#10;&#10;AI-generated content may be incorrect."/>
             <wp:cNvGraphicFramePr>
               <a:graphicFrameLocks xmlns:a="http://schemas.openxmlformats.org/drawingml/2006/main" noChangeAspect="1"/>
             </wp:cNvGraphicFramePr>
@@ -49,7 +49,7 @@
               <a:graphicData uri="http://schemas.openxmlformats.org/drawingml/2006/picture">
                 <pic:pic xmlns:pic="http://schemas.openxmlformats.org/drawingml/2006/picture">
                   <pic:nvPicPr>
-                    <pic:cNvPr id="1468507677" name="Picture 2" descr="A diagram of a computer&#10;&#10;AI-generated content may be incorrect."/>
+                    <pic:cNvPr id="1277692173" name="Picture 1" descr="A diagram of a computer&#10;&#10;AI-generated content may be incorrect."/>
                     <pic:cNvPicPr>
                       <a:picLocks noChangeAspect="1" noChangeArrowheads="1"/>
                     </pic:cNvPicPr>
@@ -70,7 +70,7 @@
                   <pic:spPr bwMode="auto">
                     <a:xfrm>
                       <a:off x="0" y="0"/>
-                      <a:ext cx="5943600" cy="3649345"/>
+                      <a:ext cx="5943600" cy="3776980"/>
                     </a:xfrm>
                     <a:prstGeom prst="rect">
                       <a:avLst/>

</xml_diff>